<commit_message>
some edits a.p. Cam
</commit_message>
<xml_diff>
--- a/documents/Rain - 2026.9.14.docx
+++ b/documents/Rain - 2026.9.14.docx
@@ -842,7 +842,14 @@
           <w:rFonts w:ascii="Times New Roman" w:hAnsi="Times New Roman" w:cs="Times New Roman"/>
           <w:lang w:val="en-CA"/>
         </w:rPr>
-        <w:t>makes it impossible for me to understand the enjoyment others seem to display towards the rain.</w:t>
+        <w:t>make</w:t>
+      </w:r>
+      <w:r>
+        <w:rPr>
+          <w:rFonts w:ascii="Times New Roman" w:hAnsi="Times New Roman" w:cs="Times New Roman"/>
+          <w:lang w:val="en-CA"/>
+        </w:rPr>
+        <w:t xml:space="preserve"> it impossible for me to understand the enjoyment others seem to display towards the rain.</w:t>
       </w:r>
       <w:r>
         <w:rPr>
@@ -1334,7 +1341,21 @@
           <w:rFonts w:ascii="Times New Roman" w:hAnsi="Times New Roman" w:cs="Times New Roman" w:hint="eastAsia"/>
           <w:lang w:val="en-CA"/>
         </w:rPr>
-        <w:t>As threatening as they sound</w:t>
+        <w:t xml:space="preserve">As threatening as </w:t>
+      </w:r>
+      <w:r>
+        <w:rPr>
+          <w:rFonts w:ascii="Times New Roman" w:hAnsi="Times New Roman" w:cs="Times New Roman"/>
+          <w:lang w:val="en-CA"/>
+        </w:rPr>
+        <w:t>my lungs</w:t>
+      </w:r>
+      <w:r>
+        <w:rPr>
+          <w:rFonts w:ascii="Times New Roman" w:hAnsi="Times New Roman" w:cs="Times New Roman" w:hint="eastAsia"/>
+          <w:lang w:val="en-CA"/>
+        </w:rPr>
+        <w:t xml:space="preserve"> sound</w:t>
       </w:r>
       <w:r>
         <w:rPr>
@@ -1531,14 +1552,14 @@
           <w:rFonts w:ascii="Times New Roman" w:hAnsi="Times New Roman" w:cs="Times New Roman"/>
           <w:lang w:val="en-CA"/>
         </w:rPr>
-        <w:t>nee</w:t>
-      </w:r>
-      <w:r>
-        <w:rPr>
-          <w:rFonts w:ascii="Times New Roman" w:hAnsi="Times New Roman" w:cs="Times New Roman" w:hint="eastAsia"/>
-          <w:lang w:val="en-CA"/>
-        </w:rPr>
-        <w:t xml:space="preserve">ded. </w:t>
+        <w:t>it needs</w:t>
+      </w:r>
+      <w:r>
+        <w:rPr>
+          <w:rFonts w:ascii="Times New Roman" w:hAnsi="Times New Roman" w:cs="Times New Roman" w:hint="eastAsia"/>
+          <w:lang w:val="en-CA"/>
+        </w:rPr>
+        <w:t xml:space="preserve">. </w:t>
       </w:r>
       <w:r>
         <w:rPr>
@@ -1622,27 +1643,6 @@
           <w:rFonts w:ascii="Times New Roman" w:hAnsi="Times New Roman" w:cs="Times New Roman" w:hint="eastAsia"/>
           <w:lang w:val="en-CA"/>
         </w:rPr>
-        <w:t>inst</w:t>
-      </w:r>
-      <w:r>
-        <w:rPr>
-          <w:rFonts w:ascii="Times New Roman" w:hAnsi="Times New Roman" w:cs="Times New Roman" w:hint="eastAsia"/>
-          <w:lang w:val="en-CA"/>
-        </w:rPr>
-        <w:t>antly</w:t>
-      </w:r>
-      <w:r>
-        <w:rPr>
-          <w:rFonts w:ascii="Times New Roman" w:hAnsi="Times New Roman" w:cs="Times New Roman" w:hint="eastAsia"/>
-          <w:lang w:val="en-CA"/>
-        </w:rPr>
-        <w:t xml:space="preserve"> </w:t>
-      </w:r>
-      <w:r>
-        <w:rPr>
-          <w:rFonts w:ascii="Times New Roman" w:hAnsi="Times New Roman" w:cs="Times New Roman" w:hint="eastAsia"/>
-          <w:lang w:val="en-CA"/>
-        </w:rPr>
         <w:t>cause</w:t>
       </w:r>
       <w:r>
@@ -1692,14 +1692,7 @@
           <w:rFonts w:ascii="Times New Roman" w:hAnsi="Times New Roman" w:cs="Times New Roman" w:hint="eastAsia"/>
           <w:lang w:val="en-CA"/>
         </w:rPr>
-        <w:t>to</w:t>
-      </w:r>
-      <w:r>
-        <w:rPr>
-          <w:rFonts w:ascii="Times New Roman" w:hAnsi="Times New Roman" w:cs="Times New Roman" w:hint="eastAsia"/>
-          <w:lang w:val="en-CA"/>
-        </w:rPr>
-        <w:t xml:space="preserve"> begin</w:t>
+        <w:t>begin</w:t>
       </w:r>
       <w:r>
         <w:rPr>
@@ -1941,14 +1934,56 @@
           <w:rFonts w:ascii="Times New Roman" w:hAnsi="Times New Roman" w:cs="Times New Roman"/>
           <w:lang w:val="en-CA"/>
         </w:rPr>
-        <w:t xml:space="preserve"> which, for most, is already terrifying enough. Naturally, the sight becomes ten times worse when the fish is replaced with</w:t>
-      </w:r>
-      <w:r>
-        <w:rPr>
-          <w:rFonts w:ascii="Times New Roman" w:hAnsi="Times New Roman" w:cs="Times New Roman" w:hint="eastAsia"/>
-          <w:lang w:val="en-CA"/>
-        </w:rPr>
-        <w:t xml:space="preserve"> a fully grown man who was perfectly well just a moment ago</w:t>
+        <w:t xml:space="preserve"> which, for most, is already terrifying enough. Naturally, the sight becomes </w:t>
+      </w:r>
+      <w:r>
+        <w:rPr>
+          <w:rFonts w:ascii="Times New Roman" w:hAnsi="Times New Roman" w:cs="Times New Roman"/>
+          <w:lang w:val="en-CA"/>
+        </w:rPr>
+        <w:t xml:space="preserve">far </w:t>
+      </w:r>
+      <w:r>
+        <w:rPr>
+          <w:rFonts w:ascii="Times New Roman" w:hAnsi="Times New Roman" w:cs="Times New Roman"/>
+          <w:lang w:val="en-CA"/>
+        </w:rPr>
+        <w:t>worse when th</w:t>
+      </w:r>
+      <w:r>
+        <w:rPr>
+          <w:rFonts w:ascii="Times New Roman" w:hAnsi="Times New Roman" w:cs="Times New Roman"/>
+          <w:lang w:val="en-CA"/>
+        </w:rPr>
+        <w:t>at</w:t>
+      </w:r>
+      <w:r>
+        <w:rPr>
+          <w:rFonts w:ascii="Times New Roman" w:hAnsi="Times New Roman" w:cs="Times New Roman"/>
+          <w:lang w:val="en-CA"/>
+        </w:rPr>
+        <w:t xml:space="preserve"> fish is replaced with</w:t>
+      </w:r>
+      <w:r>
+        <w:rPr>
+          <w:rFonts w:ascii="Times New Roman" w:hAnsi="Times New Roman" w:cs="Times New Roman" w:hint="eastAsia"/>
+          <w:lang w:val="en-CA"/>
+        </w:rPr>
+        <w:t xml:space="preserve"> a fully grown man who was perfectly </w:t>
+      </w:r>
+      <w:r>
+        <w:rPr>
+          <w:rFonts w:ascii="Times New Roman" w:hAnsi="Times New Roman" w:cs="Times New Roman"/>
+          <w:lang w:val="en-CA"/>
+        </w:rPr>
+        <w:t>fine</w:t>
+      </w:r>
+      <w:r>
+        <w:rPr>
+          <w:rFonts w:ascii="Times New Roman" w:hAnsi="Times New Roman" w:cs="Times New Roman" w:hint="eastAsia"/>
+          <w:lang w:val="en-CA"/>
+        </w:rPr>
+        <w:t xml:space="preserve"> just a moment ago</w:t>
       </w:r>
       <w:r>
         <w:rPr>
@@ -2169,7 +2204,14 @@
           <w:rFonts w:ascii="Times New Roman" w:hAnsi="Times New Roman" w:cs="Times New Roman" w:hint="eastAsia"/>
           <w:lang w:val="en-CA"/>
         </w:rPr>
-        <w:t xml:space="preserve"> to weaken</w:t>
+        <w:t xml:space="preserve"> to </w:t>
+      </w:r>
+      <w:r>
+        <w:rPr>
+          <w:rFonts w:ascii="Times New Roman" w:hAnsi="Times New Roman" w:cs="Times New Roman"/>
+          <w:lang w:val="en-CA"/>
+        </w:rPr>
+        <w:t>deblitate</w:t>
       </w:r>
       <w:r>
         <w:rPr>
@@ -2288,7 +2330,21 @@
           <w:rFonts w:ascii="Times New Roman" w:hAnsi="Times New Roman" w:cs="Times New Roman" w:hint="eastAsia"/>
           <w:lang w:val="en-CA"/>
         </w:rPr>
-        <w:t xml:space="preserve"> and my feet to give out, bringing me to my knees near the curb, placing my head outside the protection of the roof, directly under the pouring rain.</w:t>
+        <w:t xml:space="preserve"> and my feet to give out, bringing me to my knees near the curb, placing my head outside the protection of the roof, directly under the </w:t>
+      </w:r>
+      <w:r>
+        <w:rPr>
+          <w:rFonts w:ascii="Times New Roman" w:hAnsi="Times New Roman" w:cs="Times New Roman"/>
+          <w:lang w:val="en-CA"/>
+        </w:rPr>
+        <w:t>torrential</w:t>
+      </w:r>
+      <w:r>
+        <w:rPr>
+          <w:rFonts w:ascii="Times New Roman" w:hAnsi="Times New Roman" w:cs="Times New Roman" w:hint="eastAsia"/>
+          <w:lang w:val="en-CA"/>
+        </w:rPr>
+        <w:t xml:space="preserve"> rain.</w:t>
       </w:r>
     </w:p>
     <w:p>
@@ -2327,28 +2383,14 @@
           <w:rFonts w:ascii="Times New Roman" w:hAnsi="Times New Roman" w:cs="Times New Roman" w:hint="eastAsia"/>
           <w:lang w:val="en-CA"/>
         </w:rPr>
-        <w:t xml:space="preserve"> and my throat whistling, </w:t>
-      </w:r>
-      <w:r>
-        <w:rPr>
-          <w:rFonts w:ascii="Times New Roman" w:hAnsi="Times New Roman" w:cs="Times New Roman" w:hint="eastAsia"/>
-          <w:lang w:val="en-CA"/>
-        </w:rPr>
-        <w:t xml:space="preserve">it </w:t>
-      </w:r>
-      <w:r>
-        <w:rPr>
-          <w:rFonts w:ascii="Times New Roman" w:hAnsi="Times New Roman" w:cs="Times New Roman" w:hint="eastAsia"/>
-          <w:lang w:val="en-CA"/>
-        </w:rPr>
-        <w:t>was</w:t>
-      </w:r>
-      <w:r>
-        <w:rPr>
-          <w:rFonts w:ascii="Times New Roman" w:hAnsi="Times New Roman" w:cs="Times New Roman" w:hint="eastAsia"/>
-          <w:lang w:val="en-CA"/>
-        </w:rPr>
-        <w:t xml:space="preserve"> at this time that I</w:t>
+        <w:t xml:space="preserve"> and my throat whistling,</w:t>
+      </w:r>
+      <w:r>
+        <w:rPr>
+          <w:rFonts w:ascii="Times New Roman" w:hAnsi="Times New Roman" w:cs="Times New Roman" w:hint="eastAsia"/>
+          <w:lang w:val="en-CA"/>
+        </w:rPr>
+        <w:t xml:space="preserve"> I</w:t>
       </w:r>
       <w:r>
         <w:rPr>

</xml_diff>